<commit_message>
Update study notes introductions for all languages for 2026-06-23 release
</commit_message>
<xml_diff>
--- a/eng/docx/06.content.docx
+++ b/eng/docx/06.content.docx
@@ -231,7 +231,7 @@
         <w:rPr>
           <w:lang w:val="en_US" w:bidi="en_US"/>
         </w:rPr>
-        <w:t>The account of Israel’s soldiers walking around Jericho until its walls came tumbling down is one of the most famous in the Bible. Joshua had served as Moses’ apprentice, so when God appointed Joshua as Israel’s leader, he was ready. He led the Israelites across the Jordan River and through two campaigns that enabled them to settle the hill country of Canaan. As they began to live there, Joshua divided the land among Israel’s twelve tribes. The book of Joshua reveals much about God: He judges sin and faithfully keeps his promises.</w:t>
+        <w:t>The story of Israel’s soldiers walking around Jericho until its walls fell is one of the most famous stories in the Bible. Joshua had served as Moses’s helper. So when God made Joshua the leader of Israel, Joshua was ready. He led the Israelites across the Jordan River. Then he led them in two military campaigns, which helped them settle in the hill country of Canaan. After they began to live there, Joshua divided the land among the 12 tribes of Israel. The book of Joshua teaches important truths about God. God judges sin, and he faithfully keeps his promises.</w:t>
       </w:r>
     </w:p>
     <w:p>
@@ -256,7 +256,7 @@
         <w:rPr>
           <w:lang w:val="en_US" w:bidi="en_US"/>
         </w:rPr>
-        <w:t>When Israel was in Egypt, they were enslaved by a nation that was the most powerful, prosperous, and secure on earth. But God intervened on Israel’s behalf, and Egypt was devastated. The Israelites then spent forty years in the wilderness because they refused to believe that God could do for them in Canaan what he had already done in bringing them out of Egypt. The disbelieving generation died and a new generation came of age. The new generation believed God’s promises and was ready to invade the land of Canaan.</w:t>
+        <w:t>When Israel was in Egypt, the Egyptians made them slaves. Egypt was powerful, rich, and well protected. But God acted to rescue Israel, and Egypt suffered great loss. Then the Israelites spent 40 years in the wilderness. This happened because they refused to trust that God could help them in Canaan, just as he had already helped them leave Egypt. That unbelieving generation died, and a new generation grew up. This new generation believed God’s promises and was ready to enter the land of Canaan.</w:t>
       </w:r>
     </w:p>
     <w:p>
@@ -270,7 +270,83 @@
         <w:rPr>
           <w:lang w:val="en_US" w:bidi="en_US"/>
         </w:rPr>
-        <w:t>Ancient Canaan was subdivided by geographical features into four narrow north–south strips. (1) To the east of the Jordan River was the plateau of Transjordan (the land “across the Jordan”). (2) Westward, the land drops steeply into the deep cut of the Jordan River valley. The deepest dry point of this valley, the shore of the Dead Sea, marks the lowest dry land on the surface of the earth. (3) The central hill country runs from the mountains and hills of Galilee in the north to the Negev in the south. (4) The Coastal Plain lies along the Mediterranean Sea, interrupted near its northern end by the ridge of Mount Carmel that juts into the sea. In the narrative of Joshua, Israel began at Acacia Grove in Transjordan, crossed the Jordan River, conquered Jericho and the central hill country, and took up settlements in the regions that had been cleared.</w:t>
+        <w:t>Ancient Canaan had four narrow regions that ran from north to south.</w:t>
+      </w:r>
+    </w:p>
+    <w:p>
+      <w:pPr>
+        <w:pStyle w:val="ListNumber"/>
+        <w:numPr>
+          <w:ilvl w:val="0"/>
+          <w:numId w:val="14"/>
+        </w:numPr>
+        <w:spacing w:line="240" w:lineRule="auto"/>
+        <w:ind w:left="720"/>
+      </w:pPr>
+      <w:r>
+        <w:rPr>
+          <w:lang w:val="en_US" w:bidi="en_US"/>
+        </w:rPr>
+      </w:r>
+      <w:r>
+        <w:rPr>
+          <w:lang w:val="en_US" w:bidi="en_US"/>
+        </w:rPr>
+        <w:t>East of the Jordan River was the plateau of Transjordan. Transjordan means</w:t>
+      </w:r>
+    </w:p>
+    <w:p>
+      <w:pPr>
+        <w:pStyle w:val="ListNumber"/>
+        <w:spacing w:line="240" w:lineRule="auto"/>
+        <w:ind w:left="720"/>
+      </w:pPr>
+      <w:r>
+        <w:rPr>
+          <w:lang w:val="en_US" w:bidi="en_US"/>
+        </w:rPr>
+      </w:r>
+      <w:r>
+        <w:rPr>
+          <w:lang w:val="en_US" w:bidi="en_US"/>
+        </w:rPr>
+        <w:t>West of Transjordan, the land drops steeply into the Jordan River valley. The shore of the Dead Sea is the deepest dry point in this valley. It is also the lowest dry land on earth.</w:t>
+      </w:r>
+    </w:p>
+    <w:p>
+      <w:pPr>
+        <w:pStyle w:val="ListNumber"/>
+        <w:spacing w:line="240" w:lineRule="auto"/>
+        <w:ind w:left="720"/>
+      </w:pPr>
+      <w:r>
+        <w:rPr>
+          <w:lang w:val="en_US" w:bidi="en_US"/>
+        </w:rPr>
+      </w:r>
+      <w:r>
+        <w:rPr>
+          <w:lang w:val="en_US" w:bidi="en_US"/>
+        </w:rPr>
+        <w:t>The central hill country runs from the mountains and hills of Galilee in the north to the Negev in the south.</w:t>
+      </w:r>
+    </w:p>
+    <w:p>
+      <w:pPr>
+        <w:pStyle w:val="ListNumber"/>
+        <w:spacing w:line="240" w:lineRule="auto"/>
+        <w:ind w:left="720"/>
+      </w:pPr>
+      <w:r>
+        <w:rPr>
+          <w:lang w:val="en_US" w:bidi="en_US"/>
+        </w:rPr>
+      </w:r>
+      <w:r>
+        <w:rPr>
+          <w:lang w:val="en_US" w:bidi="en_US"/>
+        </w:rPr>
+        <w:t>The coastal plain lies along the Mediterranean Sea. Near its northern end, the ridge of Mount Carmel reaches out into the sea.</w:t>
       </w:r>
     </w:p>
     <w:p>
@@ -284,18 +360,7 @@
         <w:rPr>
           <w:lang w:val="en_US" w:bidi="en_US"/>
         </w:rPr>
-        <w:t>Much of Canaan was organized into small city-states, each with its own king. These city-states were grouped in ever-shifting coalitions. The assembling of a southern and then a northern coalition against the invading Israelites was as close to total unity as these city-states ever came. However, even these coalitions were not enough to save the Canaanites.</w:t>
-      </w:r>
-    </w:p>
-    <w:p>
-      <w:pPr>
-        <w:pStyle w:val="Heading2"/>
-      </w:pPr>
-      <w:r>
-        <w:rPr>
-          <w:lang w:val="en_US" w:bidi="en_US"/>
-        </w:rPr>
-        <w:t>Summary</w:t>
+        <w:t>In the story of Joshua, Israel began at Shittim in Transjordan. Then the Israelites crossed the Jordan River, conquered Jericho and the central hill country, and settled in the areas they had taken.</w:t>
       </w:r>
     </w:p>
     <w:p>
@@ -309,7 +374,32 @@
         <w:rPr>
           <w:lang w:val="en_US" w:bidi="en_US"/>
         </w:rPr>
-        <w:t xml:space="preserve">The first half of Joshua (chs </w:t>
+        <w:t>Much of Canaan was organized into small city-states. Each city-state had its own king. These city-states often joined together in groups, but these groups changed often. The southern and northern groups that fought against Israel were the closest these city-states came to being fully united. Even so, these groups were not strong enough to save the Canaanites.</w:t>
+      </w:r>
+    </w:p>
+    <w:p>
+      <w:pPr>
+        <w:pStyle w:val="Heading2"/>
+      </w:pPr>
+      <w:r>
+        <w:rPr>
+          <w:lang w:val="en_US" w:bidi="en_US"/>
+        </w:rPr>
+        <w:t>Summary</w:t>
+      </w:r>
+    </w:p>
+    <w:p>
+      <w:pPr/>
+      <w:r>
+        <w:rPr>
+          <w:lang w:val="en_US" w:bidi="en_US"/>
+        </w:rPr>
+      </w:r>
+      <w:r>
+        <w:rPr>
+          <w:lang w:val="en_US" w:bidi="en_US"/>
+        </w:rPr>
+        <w:t xml:space="preserve">The first half of Joshua,, chapters </w:t>
       </w:r>
       <w:hyperlink r:id="rId13">
         <w:r>
@@ -327,7 +417,7 @@
         <w:rPr>
           <w:lang w:val="en_US" w:bidi="en_US"/>
         </w:rPr>
-        <w:t xml:space="preserve">) is among the most dramatic narratives in the Bible. In preparing Israel to cross the Jordan, Joshua sent two young men to scout out Jericho, a town Israel would have to conquer in order to enter the hill country. The young scouts were aided by a woman named Rahab, and they promised to spare her and her family in return for her help (ch </w:t>
+        <w:t xml:space="preserve">, is one of the most dramatic stories in the Bible. As Joshua prepared Israel to cross the Jordan River, he sent two young men to spy on Jericho. Israel would have to conquer this town in order to enter the hill country. A woman named Rahab helped the two young spies. They promised to spare Rahab and her family because she helped them (chapter </w:t>
       </w:r>
       <w:hyperlink r:id="rId14">
         <w:r>
@@ -345,7 +435,7 @@
         <w:rPr>
           <w:lang w:val="en_US" w:bidi="en_US"/>
         </w:rPr>
-        <w:t xml:space="preserve">). The Israelites crossed the Jordan River, the flow of which had been miraculously halted (ch </w:t>
+        <w:t xml:space="preserve">). The Israelites crossed the Jordan River after God stopped its flow by a miracle (chapter </w:t>
       </w:r>
       <w:hyperlink r:id="rId15">
         <w:r>
@@ -363,7 +453,7 @@
         <w:rPr>
           <w:lang w:val="en_US" w:bidi="en_US"/>
         </w:rPr>
-        <w:t xml:space="preserve">). Then God gave Israel the city of Jericho by causing its walls to fall (ch </w:t>
+        <w:t xml:space="preserve">). Then God gave Israel the city of Jericho by causing its walls to fall (chapter </w:t>
       </w:r>
       <w:hyperlink r:id="rId16">
         <w:r>
@@ -395,7 +485,7 @@
         <w:rPr>
           <w:lang w:val="en_US" w:bidi="en_US"/>
         </w:rPr>
-        <w:t xml:space="preserve">Possession of Jericho opened the routes that ascended westward into the hill country. But a man named Achan disobeyed God’s instructions, displeasing the Lord, and Israel suffered a setback before Achan’s sin was discovered and judged (ch </w:t>
+        <w:t xml:space="preserve">After Israel took Jericho, the Israelites could enter the hill country to the west. But a man named Achan disobeyed God’s instructions. This displeased the Lord, and Israel suffered a defeat. Later, Achan’s sin was discovered and judged (chapter </w:t>
       </w:r>
       <w:hyperlink r:id="rId17">
         <w:r>
@@ -413,7 +503,21 @@
         <w:rPr>
           <w:lang w:val="en_US" w:bidi="en_US"/>
         </w:rPr>
-        <w:t xml:space="preserve">). God then gave Joshua a resounding victory over the hastily gathered coalition of southern Canaanite city-states; God even granted Joshua’s request for the sun and moon to stand still until the victory was complete (ch </w:t>
+        <w:t xml:space="preserve">). </w:t>
+      </w:r>
+    </w:p>
+    <w:p>
+      <w:pPr/>
+      <w:r>
+        <w:rPr>
+          <w:lang w:val="en_US" w:bidi="en_US"/>
+        </w:rPr>
+      </w:r>
+      <w:r>
+        <w:rPr>
+          <w:lang w:val="en_US" w:bidi="en_US"/>
+        </w:rPr>
+        <w:t xml:space="preserve">Then God gave Joshua a great victory over a southern group of Canaanite city-states. These city-states had quickly joined together to fight Israel. God even answered Joshua’s request for the sun and moon to stand still until the battle was over (chapter </w:t>
       </w:r>
       <w:hyperlink r:id="rId18">
         <w:r>
@@ -431,7 +535,21 @@
         <w:rPr>
           <w:lang w:val="en_US" w:bidi="en_US"/>
         </w:rPr>
-        <w:t xml:space="preserve">). Joshua then turned northward, where he gained a similarly decisive victory over a northern coalition of city-states (ch </w:t>
+        <w:t xml:space="preserve">). </w:t>
+      </w:r>
+    </w:p>
+    <w:p>
+      <w:pPr/>
+      <w:r>
+        <w:rPr>
+          <w:lang w:val="en_US" w:bidi="en_US"/>
+        </w:rPr>
+      </w:r>
+      <w:r>
+        <w:rPr>
+          <w:lang w:val="en_US" w:bidi="en_US"/>
+        </w:rPr>
+        <w:t xml:space="preserve">Joshua then moved north and achieved a similar victory over a northern group of city-states (chapter </w:t>
       </w:r>
       <w:hyperlink r:id="rId19">
         <w:r>
@@ -449,7 +567,7 @@
         <w:rPr>
           <w:lang w:val="en_US" w:bidi="en_US"/>
         </w:rPr>
-        <w:t>). The entire hill country, from the Negev in the south to Upper Galilee in the north, now lay open for Israelite settlement.</w:t>
+        <w:t>). The entire hill country was open for Israel to settle in. This land reached from the Negev in the south to Upper Galilee in the north.</w:t>
       </w:r>
     </w:p>
     <w:p>
@@ -463,7 +581,7 @@
         <w:rPr>
           <w:lang w:val="en_US" w:bidi="en_US"/>
         </w:rPr>
-        <w:t xml:space="preserve">The second half of Joshua (chs </w:t>
+        <w:t xml:space="preserve">The second half of Joshua, chapters </w:t>
       </w:r>
       <w:hyperlink r:id="rId20">
         <w:r>
@@ -481,7 +599,7 @@
         <w:rPr>
           <w:lang w:val="en_US" w:bidi="en_US"/>
         </w:rPr>
-        <w:t xml:space="preserve">) contains the informative account of the allotment of Israel’s territory, including detailed descriptions of the territories given to Judah, Benjamin, and Joseph (chs </w:t>
+        <w:t xml:space="preserve">, tells how Israel’s land was divided among the tribes. It gives many details about the land given to Judah, Benjamin, and Joseph’s descendants (chapters </w:t>
       </w:r>
       <w:hyperlink r:id="rId21">
         <w:r>
@@ -499,7 +617,21 @@
         <w:rPr>
           <w:lang w:val="en_US" w:bidi="en_US"/>
         </w:rPr>
-        <w:t xml:space="preserve">); these tribes became the central tribes of Israel. Caleb’s and Joshua’s inheritances begin and end this section of territorial allotments (chs </w:t>
+        <w:t>). These tribes became the central tribes of Israel.</w:t>
+      </w:r>
+    </w:p>
+    <w:p>
+      <w:pPr/>
+      <w:r>
+        <w:rPr>
+          <w:lang w:val="en_US" w:bidi="en_US"/>
+        </w:rPr>
+      </w:r>
+      <w:r>
+        <w:rPr>
+          <w:lang w:val="en_US" w:bidi="en_US"/>
+        </w:rPr>
+        <w:t xml:space="preserve">This section begins with Caleb’s inheritance and ends with Joshua’s inheritance (chapters </w:t>
       </w:r>
       <w:hyperlink r:id="rId22">
         <w:r>
@@ -535,7 +667,7 @@
         <w:rPr>
           <w:lang w:val="en_US" w:bidi="en_US"/>
         </w:rPr>
-        <w:t xml:space="preserve">). The designation of six cities of refuge (ch </w:t>
+        <w:t xml:space="preserve">). Then six cities of refuge were chosen. These were cities where a person could seek safety after accidentally killing someone (chapter </w:t>
       </w:r>
       <w:hyperlink r:id="rId24">
         <w:r>
@@ -553,7 +685,7 @@
         <w:rPr>
           <w:lang w:val="en_US" w:bidi="en_US"/>
         </w:rPr>
-        <w:t xml:space="preserve">) and the assignment of towns to the Levites within each tribal territory (ch </w:t>
+        <w:t xml:space="preserve">). Towns were also given to the Levites inside each tribal area (chapter </w:t>
       </w:r>
       <w:hyperlink r:id="rId25">
         <w:r>
@@ -571,7 +703,21 @@
         <w:rPr>
           <w:lang w:val="en_US" w:bidi="en_US"/>
         </w:rPr>
-        <w:t xml:space="preserve">) complete the process of allotting the land to the tribes. The 2½ tribes given land on the east side of the Jordan River were released to return home, but they had to clear up a misunderstanding with the western tribes about the building of a memorial (ch </w:t>
+        <w:t>). This completed the process of dividing the land among the tribes.</w:t>
+      </w:r>
+    </w:p>
+    <w:p>
+      <w:pPr/>
+      <w:r>
+        <w:rPr>
+          <w:lang w:val="en_US" w:bidi="en_US"/>
+        </w:rPr>
+      </w:r>
+      <w:r>
+        <w:rPr>
+          <w:lang w:val="en_US" w:bidi="en_US"/>
+        </w:rPr>
+        <w:t xml:space="preserve">The two and a half tribes who received land east of the Jordan River were then allowed to return home. But first, they had to correct a misunderstanding with the western tribes about a memorial they had built (chapter </w:t>
       </w:r>
       <w:hyperlink r:id="rId26">
         <w:r>
@@ -589,7 +735,21 @@
         <w:rPr>
           <w:lang w:val="en_US" w:bidi="en_US"/>
         </w:rPr>
-        <w:t xml:space="preserve">). The book concludes with Joshua’s farewell (ch </w:t>
+        <w:t xml:space="preserve">). </w:t>
+      </w:r>
+    </w:p>
+    <w:p>
+      <w:pPr/>
+      <w:r>
+        <w:rPr>
+          <w:lang w:val="en_US" w:bidi="en_US"/>
+        </w:rPr>
+      </w:r>
+      <w:r>
+        <w:rPr>
+          <w:lang w:val="en_US" w:bidi="en_US"/>
+        </w:rPr>
+        <w:t xml:space="preserve">The book ends with Joshua's farewell speech (chapter </w:t>
       </w:r>
       <w:hyperlink r:id="rId27">
         <w:r>
@@ -607,7 +767,7 @@
         <w:rPr>
           <w:lang w:val="en_US" w:bidi="en_US"/>
         </w:rPr>
-        <w:t xml:space="preserve">), his convening of the people to renew their covenant with God, and three prominent funerals (ch </w:t>
+        <w:t xml:space="preserve">). Then Joshua gathered the people to renew their covenant with God. The book closes with three important burials (chapter </w:t>
       </w:r>
       <w:hyperlink r:id="rId28">
         <w:r>
@@ -650,31 +810,20 @@
         <w:rPr>
           <w:lang w:val="en_US" w:bidi="en_US"/>
         </w:rPr>
-        <w:t xml:space="preserve">Nowhere does the book of Joshua claim that Joshua was its author. Both the frequent occurrence of the phrase “to this day” and the reference to </w:t>
+        <w:t xml:space="preserve">The book of Joshua does not say that Joshua wrote it. The repeated phrase </w:t>
       </w:r>
       <w:r>
         <w:rPr>
           <w:i/>
           <w:lang w:val="en_US" w:bidi="en_US"/>
         </w:rPr>
-        <w:t>The Book of Jashar</w:t>
-      </w:r>
-      <w:r>
-        <w:rPr>
-          <w:lang w:val="en_US" w:bidi="en_US"/>
-        </w:rPr>
-        <w:t>the book of Jasher as a source for Joshua indicate that the book was written after Joshua’s death. Yet the occurrence of the pronoun “we” in portions of the narrative provides evidence that at least some of the book is based on personal recollections of Joshua and of those under his command. It is likely that the book of Joshua existed in more or less its present form no later than Israel’s early monarchy (the time of David and Solomon). The human author or authors of Joshua remain anonymous.</w:t>
-      </w:r>
-    </w:p>
-    <w:p>
-      <w:pPr>
-        <w:pStyle w:val="Heading2"/>
-      </w:pPr>
-      <w:r>
-        <w:rPr>
-          <w:lang w:val="en_US" w:bidi="en_US"/>
-        </w:rPr>
-        <w:t>Joshua as History</w:t>
+        <w:t>to this day</w:t>
+      </w:r>
+      <w:r>
+        <w:rPr>
+          <w:lang w:val="en_US" w:bidi="en_US"/>
+        </w:rPr>
+        <w:t xml:space="preserve"> shows that parts of the book were written after the events happened. This suggests that the book was written after Joshua’s death.</w:t>
       </w:r>
     </w:p>
     <w:p>
@@ -688,7 +837,31 @@
         <w:rPr>
           <w:lang w:val="en_US" w:bidi="en_US"/>
         </w:rPr>
-        <w:t>In the last two centuries, some scholars have attempted to discredit the historical validity of Joshua by arguing that Transjordan (the area east of the Jordan River) and the cities of Jericho and Ai were not occupied when Israel entered Canaan, so Israel could not have conquered them. However, archaeological surveys show that Transjordan was occupied when Israel entered Canaan and that Jericho was indeed destroyed as Joshua describes.</w:t>
+        <w:t xml:space="preserve">However, some parts of the story use the word </w:t>
+      </w:r>
+      <w:r>
+        <w:rPr>
+          <w:i/>
+          <w:lang w:val="en_US" w:bidi="en_US"/>
+        </w:rPr>
+        <w:t>we</w:t>
+      </w:r>
+      <w:r>
+        <w:rPr>
+          <w:lang w:val="en_US" w:bidi="en_US"/>
+        </w:rPr>
+        <w:t>. This may show that some of the book comes from personal memories of Joshua and the people who served under him. The book of Joshua was probably close to its present form by the early years of Israel’s monarchy, during the time of David and Solomon. The human author, or authors, of Joshua are not named.</w:t>
+      </w:r>
+    </w:p>
+    <w:p>
+      <w:pPr>
+        <w:pStyle w:val="Heading2"/>
+      </w:pPr>
+      <w:r>
+        <w:rPr>
+          <w:lang w:val="en_US" w:bidi="en_US"/>
+        </w:rPr>
+        <w:t>Joshua as History</w:t>
       </w:r>
     </w:p>
     <w:p>
@@ -702,7 +875,7 @@
         <w:rPr>
           <w:lang w:val="en_US" w:bidi="en_US"/>
         </w:rPr>
-        <w:t>Other scholars argue that accounts having an explanatory purpose (such as those explaining the origin of a name) cannot be historical. However, although some explanatory accounts found in ancient texts are mythical or false, many others are historically accurate. The content of the book of Joshua was probably first written down near the time of the events it includes. It shows every indication of being historically accurate, even though it does not answer every historical question readers might bring to it.</w:t>
+        <w:t>In the last two centuries, some scholars have questioned whether the book of Joshua gives a true history. They argue that Transjordan, the area east of the Jordan River, and the cities of Jericho and Ai were not occupied when Israel entered Canaan. If this were true, Israel could not have conquered them.</w:t>
       </w:r>
     </w:p>
     <w:p>
@@ -716,7 +889,7 @@
         <w:rPr>
           <w:lang w:val="en_US" w:bidi="en_US"/>
         </w:rPr>
-        <w:t>For most of the time that it has been part of the Scriptures, the book of Joshua has been regarded as reliable history. The books of Joshua, Judges, Samuel, and Kings stand in contrast with the epic, mythical, and royal self-congratulatory literature produced by surrounding cultures. These biblical books provide a selective history of ancient Israel in the land where God placed them. And they were written from a prophetic perspective—from the same point of view as Isaiah, Jeremiah, Ezekiel, and the twelve Minor Prophets—which regarded Israel as living in a covenant relationship with God.</w:t>
+        <w:t>However, archaeological surveys show that Transjordan was occupied when Israel entered Canaan. Other archaeological evidence also supports the account of Jericho’s destruction in Joshua.</w:t>
       </w:r>
     </w:p>
     <w:p>
@@ -730,7 +903,49 @@
         <w:rPr>
           <w:lang w:val="en_US" w:bidi="en_US"/>
         </w:rPr>
-        <w:t xml:space="preserve">Joshua thus records only the broad outlines of Israel’s entry into Canaan. The book of Joshua neither states nor implies that Israel destroyed all of the Canaanites and their cities. Many Canaanites remained, as the following book of Judges also makes clear. The multi-generation history of Israel recorded in Judges shows that Israel gradually became stronger and absorbed the Canaanites. By the time of King David, most people of the land regarded themselves as Israelites, although some distinct groups still remained (e.g., </w:t>
+        <w:t>Other scholars argue that stories written to explain something, such as the origin of a name, cannot also be true history. However, some ancient stories written for this purpose are false or legendary, while others are historically accurate. The content of Joshua was probably first written down near the time of the events it describes. The book gives many signs that it is historically accurate, even though it does not answer every historical question people may ask.</w:t>
+      </w:r>
+    </w:p>
+    <w:p>
+      <w:pPr/>
+      <w:r>
+        <w:rPr>
+          <w:lang w:val="en_US" w:bidi="en_US"/>
+        </w:rPr>
+      </w:r>
+      <w:r>
+        <w:rPr>
+          <w:lang w:val="en_US" w:bidi="en_US"/>
+        </w:rPr>
+        <w:t>For most of the time that the book of Joshua has been part of Scripture, Christians and Jews have viewed it as reliable history. Joshua, Judges, Samuel, and Kings are different from the epic stories, myths, and royal praise texts of nearby cultures. These biblical books give a selective history of ancient Israel in the land where God placed them.</w:t>
+      </w:r>
+    </w:p>
+    <w:p>
+      <w:pPr/>
+      <w:r>
+        <w:rPr>
+          <w:lang w:val="en_US" w:bidi="en_US"/>
+        </w:rPr>
+      </w:r>
+      <w:r>
+        <w:rPr>
+          <w:lang w:val="en_US" w:bidi="en_US"/>
+        </w:rPr>
+        <w:t>They were also written from a prophetic point of view. This means they explain Israel’s history in light of Israel’s covenant relationship with God. This is the same point of view found in Isaiah, Jeremiah, Ezekiel, and the twelve Minor Prophets.</w:t>
+      </w:r>
+    </w:p>
+    <w:p>
+      <w:pPr/>
+      <w:r>
+        <w:rPr>
+          <w:lang w:val="en_US" w:bidi="en_US"/>
+        </w:rPr>
+      </w:r>
+      <w:r>
+        <w:rPr>
+          <w:lang w:val="en_US" w:bidi="en_US"/>
+        </w:rPr>
+        <w:t xml:space="preserve">Joshua records only the main events of Israel’s entry into Canaan. The book does not say or suggest that Israel destroyed all the Canaanites and their cities. Many Canaanites remained, as the book of Judges also makes clear. Judges tells the story of Israel over several generations. It shows that Israel slowly became stronger and the Canaanites became part of Israel. By the time of King David, most people in the land saw themselves as Israelites. However, some separate groups still remained (for example, </w:t>
       </w:r>
       <w:hyperlink r:id="rId29">
         <w:r>
@@ -741,7 +956,7 @@
             <w:color w:val="0000EE"/>
             <w:u w:val="single"/>
           </w:rPr>
-          <w:t>2 Sam 5:6–8</w:t>
+          <w:t>2 Samuel 5:6–8</w:t>
         </w:r>
       </w:hyperlink>
       <w:r>
@@ -773,7 +988,7 @@
         <w:rPr>
           <w:lang w:val="en_US" w:bidi="en_US"/>
         </w:rPr>
-        <w:t>The book of Joshua emphasizes the fulfillment of God’s covenant promises to Abraham, Isaac, and Jacob. The patriarchs had traversed the land as resident aliens; now their descendants occupied it as the beneficiaries of God’s faithfulness to his promise. Even the burials at the close of the book emphasize that point. Whereas Abraham had to buy a small parcel of land to bury Sarah, now Joseph, Joshua, and Eleazar were honored with burials in the territory God had given to their descendants.</w:t>
+        <w:t>The book of Joshua shows that God kept his covenant promises to Abraham, Isaac, and Jacob. A covenant is a binding agreement. The patriarchs, the early fathers of Israel, had traveled through the land as foreigners. Now their descendants lived in it because God had faithfully kept his promise. Even the burials at the end of the book show this truth. Abraham had to buy a small piece of land to bury Sarah. But the Israelites buried Joseph, Joshua, and Eleazar in the land God had given to their descendants.</w:t>
       </w:r>
     </w:p>
     <w:p>
@@ -787,7 +1002,7 @@
         <w:rPr>
           <w:lang w:val="en_US" w:bidi="en_US"/>
         </w:rPr>
-        <w:t>The book of Joshua demonstrates that God speaks and acts with integrity and that he can be trusted to fulfill his promises. The book conveys this message in both subtle and obvious ways. The scouts’ faithfulness to Rahab and her family reflects and affirms the faithfulness of the God who had brought them to her house. The giving of Caleb’s inheritance at the beginning of the tribal allotments and the giving of Joshua’s at the end bear testimony to God’s recognition of those who remain faithful to him throughout their lifetime. Joshua also records that Israel constructed stone memorials throughout the country. These monuments served as visual aids to teach generations of Israelite children about God’s absolute faithfulness. These stone monuments eventually crumbled or were carried away for other uses, but the book of Joshua itself remains as an enduring memorial, still giving testimony of God’s goodness and faithfulness.</w:t>
+        <w:t>The book of Joshua shows that God speaks and acts with complete honesty. We can trust him to keep his promises. The book teaches this truth in both clear and quiet ways. The two spies were faithful to Rahab and her family. Their faithfulness points to the faithfulness of God, who had brought them to Rahab’s house. Caleb received his inheritance near the beginning of the land divisions. Joshua received his inheritance near the end. These two gifts show that God honors people who remain faithful to him throughout their lives.</w:t>
       </w:r>
     </w:p>
     <w:p>
@@ -801,7 +1016,7 @@
         <w:rPr>
           <w:lang w:val="en_US" w:bidi="en_US"/>
         </w:rPr>
-        <w:t>The book of Joshua also records some disturbing events. Israel destroyed Jericho and Ai and all their people. Many Israelites, including Achan and his family, died because of Achan’s sin. God fought the Canaanite coalitions that tried to prevent Israel from establishing themselves in the land. These and other episodes remind readers of the deadly seriousness of sin.</w:t>
+        <w:t>Joshua also records that Israel built stone memorials throughout the land. These stone markers helped teach Israelite children about God’s complete faithfulness. Later, these stones broke down or were taken away for other uses. But the book of Joshua still remains. It continues to testify to God’s goodness and faithfulness.</w:t>
       </w:r>
     </w:p>
     <w:p>
@@ -815,7 +1030,7 @@
         <w:rPr>
           <w:lang w:val="en_US" w:bidi="en_US"/>
         </w:rPr>
-        <w:t>In a culture where women and their rights were held with little or no regard, Joshua records a different perspective. When the land was allocated among the clans of Manasseh, the daughters of Zelophehad received their father’s inheritance, as God had instructed. Rahab’s saving of the two young scouts in the dramatic opening episode of the book also provides a radically positive assessment of a woman’s place in God’s economy.</w:t>
+        <w:t>The book of Joshua describes some troubling events. Israel destroyed Jericho and Ai and all their people. Many Israelites, including Achan and his family, died because of Achan’s sin. God fought the Canaanite groups that tried to stop Israel from settling in the land. These and other events show the serious consequences of sin.</w:t>
       </w:r>
     </w:p>
     <w:p>
@@ -829,7 +1044,21 @@
         <w:rPr>
           <w:lang w:val="en_US" w:bidi="en_US"/>
         </w:rPr>
-        <w:t>The book of Joshua has much for contemporary readers to ponder about God himself, the consequences of human good and evil, and God’s passionate commitment to human redemption and the restoration of the divine-human relationship.</w:t>
+        <w:t xml:space="preserve">In a culture where women were often given little honor or protection, Joshua gives a different picture. When the land was divided among the clans of Manasseh, the daughters of Zelophehad received their father’s inheritance, just as God had instructed. Rahab also saved the two young spies in the dramatic opening part of the book. Her story shows that women have an honored place in God’s work. </w:t>
+      </w:r>
+    </w:p>
+    <w:p>
+      <w:pPr/>
+      <w:r>
+        <w:rPr>
+          <w:lang w:val="en_US" w:bidi="en_US"/>
+        </w:rPr>
+      </w:r>
+      <w:r>
+        <w:rPr>
+          <w:lang w:val="en_US" w:bidi="en_US"/>
+        </w:rPr>
+        <w:t>The book of Joshua gives people today much to consider about God. It shows the results of human good and evil. It also shows God’s deep commitment to redeem people and restore their relationship with him.</w:t>
       </w:r>
       <w:r>
         <w:rPr>
@@ -2731,6 +2960,12 @@
   </w:num>
   <w:num w:numId="13" w16cid:durableId="592781308">
     <w:abstractNumId w:val="11"/>
+  </w:num>
+  <w:num w:numId="14">
+    <w:abstractNumId w:val="3"/>
+    <w:lvlOverride w:ilvl="0">
+      <w:startOverride w:val="1"/>
+    </w:lvlOverride>
   </w:num>
   <w:numIdMacAtCleanup w:val="10"/>
 </w:numbering>

</xml_diff>